<commit_message>
Updeted ducumentation, review staff_detection.py comment
</commit_message>
<xml_diff>
--- a/temp/Diagram.docx
+++ b/temp/Diagram.docx
@@ -258,17 +258,7 @@
                                 <w:sz w:val="20"/>
                                 <w:szCs w:val="20"/>
                               </w:rPr>
-                              <w:t>2</w:t>
-                            </w:r>
-                            <w:r>
-                              <w:rPr>
-                                <w:b/>
-                                <w:bCs/>
-                                <w:color w:val="153D63" w:themeColor="text2" w:themeTint="E6"/>
-                                <w:sz w:val="20"/>
-                                <w:szCs w:val="20"/>
-                              </w:rPr>
-                              <w:t xml:space="preserve">. </w:t>
+                              <w:t xml:space="preserve">2. </w:t>
                             </w:r>
                             <w:r>
                               <w:rPr>
@@ -336,17 +326,7 @@
                           <w:sz w:val="20"/>
                           <w:szCs w:val="20"/>
                         </w:rPr>
-                        <w:t>2</w:t>
-                      </w:r>
-                      <w:r>
-                        <w:rPr>
-                          <w:b/>
-                          <w:bCs/>
-                          <w:color w:val="153D63" w:themeColor="text2" w:themeTint="E6"/>
-                          <w:sz w:val="20"/>
-                          <w:szCs w:val="20"/>
-                        </w:rPr>
-                        <w:t xml:space="preserve">. </w:t>
+                        <w:t xml:space="preserve">2. </w:t>
                       </w:r>
                       <w:r>
                         <w:rPr>
@@ -1115,7 +1095,23 @@
                                 <w:sz w:val="18"/>
                                 <w:szCs w:val="18"/>
                               </w:rPr>
-                              <w:t>Confirm with 3/15 votes; refresh or expire status</w:t>
+                              <w:t xml:space="preserve">Confirm with </w:t>
+                            </w:r>
+                            <w:r>
+                              <w:rPr>
+                                <w:color w:val="404040" w:themeColor="text1" w:themeTint="BF"/>
+                                <w:sz w:val="18"/>
+                                <w:szCs w:val="18"/>
+                              </w:rPr>
+                              <w:t>5</w:t>
+                            </w:r>
+                            <w:r>
+                              <w:rPr>
+                                <w:color w:val="404040" w:themeColor="text1" w:themeTint="BF"/>
+                                <w:sz w:val="18"/>
+                                <w:szCs w:val="18"/>
+                              </w:rPr>
+                              <w:t>/15 votes; refresh or expire status</w:t>
                             </w:r>
                           </w:p>
                         </w:txbxContent>
@@ -1193,7 +1189,23 @@
                           <w:sz w:val="18"/>
                           <w:szCs w:val="18"/>
                         </w:rPr>
-                        <w:t>Confirm with 3/15 votes; refresh or expire status</w:t>
+                        <w:t xml:space="preserve">Confirm with </w:t>
+                      </w:r>
+                      <w:r>
+                        <w:rPr>
+                          <w:color w:val="404040" w:themeColor="text1" w:themeTint="BF"/>
+                          <w:sz w:val="18"/>
+                          <w:szCs w:val="18"/>
+                        </w:rPr>
+                        <w:t>5</w:t>
+                      </w:r>
+                      <w:r>
+                        <w:rPr>
+                          <w:color w:val="404040" w:themeColor="text1" w:themeTint="BF"/>
+                          <w:sz w:val="18"/>
+                          <w:szCs w:val="18"/>
+                        </w:rPr>
+                        <w:t>/15 votes; refresh or expire status</w:t>
                       </w:r>
                     </w:p>
                   </w:txbxContent>
@@ -2858,6 +2870,10 @@
                   <v:rect id="Rectangle 6" o:spid="_x0000_s1034" style="position:absolute;left:1795;top:2692;width:17839;height:10659;visibility:visible;mso-wrap-style:square;v-text-anchor:middle" o:gfxdata="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" filled="f" strokecolor="#e8e8e8 [3214]" strokeweight="1.5pt"/>
                   <v:group id="Group 12" o:spid="_x0000_s1035" style="position:absolute;left:1682;top:2131;width:7461;height:7630" coordsize="7461,7629" o:gfxdata="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">
                     <v:group id="Group 10" o:spid="_x0000_s1036" style="position:absolute;left:1266;top:1491;width:4039;height:4055" coordsize="403907,405537" o:gfxdata="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">
+                      <v:shapetype id="_x0000_t32" coordsize="21600,21600" o:spt="32" o:oned="t" path="m,l21600,21600e" filled="f">
+                        <v:path arrowok="t" fillok="f" o:connecttype="none"/>
+                        <o:lock v:ext="edit" shapetype="t"/>
+                      </v:shapetype>
                       <v:shape id="Straight Arrow Connector 8" o:spid="_x0000_s1037" type="#_x0000_t32" style="position:absolute;width:403907;height:0;visibility:visible;mso-wrap-style:square" o:connectortype="straight" o:gfxdata="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" strokecolor="black [3213]" strokeweight="1.5pt">
                         <v:stroke endarrow="block" joinstyle="miter"/>
                       </v:shape>
@@ -3250,7 +3266,25 @@
                                 <w:sz w:val="16"/>
                                 <w:szCs w:val="16"/>
                               </w:rPr>
-                              <w:t>Training Validation</w:t>
+                              <w:t>T</w:t>
+                            </w:r>
+                            <w:r>
+                              <w:rPr>
+                                <w:b/>
+                                <w:bCs/>
+                                <w:sz w:val="16"/>
+                                <w:szCs w:val="16"/>
+                              </w:rPr>
+                              <w:t>est</w:t>
+                            </w:r>
+                            <w:r>
+                              <w:rPr>
+                                <w:b/>
+                                <w:bCs/>
+                                <w:sz w:val="16"/>
+                                <w:szCs w:val="16"/>
+                              </w:rPr>
+                              <w:t xml:space="preserve"> Validation</w:t>
                             </w:r>
                           </w:p>
                         </w:txbxContent>
@@ -3295,7 +3329,25 @@
                           <w:sz w:val="16"/>
                           <w:szCs w:val="16"/>
                         </w:rPr>
-                        <w:t>Training Validation</w:t>
+                        <w:t>T</w:t>
+                      </w:r>
+                      <w:r>
+                        <w:rPr>
+                          <w:b/>
+                          <w:bCs/>
+                          <w:sz w:val="16"/>
+                          <w:szCs w:val="16"/>
+                        </w:rPr>
+                        <w:t>est</w:t>
+                      </w:r>
+                      <w:r>
+                        <w:rPr>
+                          <w:b/>
+                          <w:bCs/>
+                          <w:sz w:val="16"/>
+                          <w:szCs w:val="16"/>
+                        </w:rPr>
+                        <w:t xml:space="preserve"> Validation</w:t>
                       </w:r>
                     </w:p>
                   </w:txbxContent>
@@ -3494,6 +3546,9 @@
         </mc:AlternateContent>
       </w:r>
       <w:r>
+        <w:rPr>
+          <w:noProof/>
+        </w:rPr>
         <w:drawing>
           <wp:inline distT="0" distB="0" distL="0" distR="0" wp14:anchorId="64E439CD" wp14:editId="2DAC7828">
             <wp:extent cx="2670272" cy="2391657"/>
@@ -3559,6 +3614,7 @@
       <w:r>
         <w:rPr>
           <w:rFonts w:eastAsia="Times New Roman"/>
+          <w:noProof/>
           <w:kern w:val="0"/>
           <w14:ligatures w14:val="none"/>
         </w:rPr>
@@ -3622,6 +3678,9 @@
         <w:jc w:val="center"/>
       </w:pPr>
       <w:r>
+        <w:rPr>
+          <w:noProof/>
+        </w:rPr>
         <w:drawing>
           <wp:inline distT="0" distB="0" distL="0" distR="0" wp14:anchorId="51D6B1F7" wp14:editId="0C36EEE5">
             <wp:extent cx="3530600" cy="1961270"/>
@@ -3793,7 +3852,25 @@
                                 <w:sz w:val="16"/>
                                 <w:szCs w:val="16"/>
                               </w:rPr>
-                              <w:t>Training Validation</w:t>
+                              <w:t>T</w:t>
+                            </w:r>
+                            <w:r>
+                              <w:rPr>
+                                <w:b/>
+                                <w:bCs/>
+                                <w:sz w:val="16"/>
+                                <w:szCs w:val="16"/>
+                              </w:rPr>
+                              <w:t>est</w:t>
+                            </w:r>
+                            <w:r>
+                              <w:rPr>
+                                <w:b/>
+                                <w:bCs/>
+                                <w:sz w:val="16"/>
+                                <w:szCs w:val="16"/>
+                              </w:rPr>
+                              <w:t xml:space="preserve"> Validation</w:t>
                             </w:r>
                           </w:p>
                         </w:txbxContent>
@@ -3838,7 +3915,25 @@
                           <w:sz w:val="16"/>
                           <w:szCs w:val="16"/>
                         </w:rPr>
-                        <w:t>Training Validation</w:t>
+                        <w:t>T</w:t>
+                      </w:r>
+                      <w:r>
+                        <w:rPr>
+                          <w:b/>
+                          <w:bCs/>
+                          <w:sz w:val="16"/>
+                          <w:szCs w:val="16"/>
+                        </w:rPr>
+                        <w:t>est</w:t>
+                      </w:r>
+                      <w:r>
+                        <w:rPr>
+                          <w:b/>
+                          <w:bCs/>
+                          <w:sz w:val="16"/>
+                          <w:szCs w:val="16"/>
+                        </w:rPr>
+                        <w:t xml:space="preserve"> Validation</w:t>
                       </w:r>
                     </w:p>
                   </w:txbxContent>
@@ -3962,6 +4057,9 @@
     </w:p>
     <w:p>
       <w:r>
+        <w:rPr>
+          <w:noProof/>
+        </w:rPr>
         <w:drawing>
           <wp:inline distT="0" distB="0" distL="0" distR="0" wp14:anchorId="3360C43B" wp14:editId="75017115">
             <wp:extent cx="2837769" cy="2544430"/>
@@ -4017,6 +4115,9 @@
         </w:drawing>
       </w:r>
       <w:r>
+        <w:rPr>
+          <w:noProof/>
+        </w:rPr>
         <w:drawing>
           <wp:inline distT="0" distB="0" distL="0" distR="0" wp14:anchorId="1734C168" wp14:editId="61F7A853">
             <wp:extent cx="2797791" cy="2541885"/>
@@ -4077,6 +4178,9 @@
         <w:jc w:val="center"/>
       </w:pPr>
       <w:r>
+        <w:rPr>
+          <w:noProof/>
+        </w:rPr>
         <w:drawing>
           <wp:inline distT="0" distB="0" distL="0" distR="0" wp14:anchorId="1B988AF2" wp14:editId="3BCDD1D5">
             <wp:extent cx="3773606" cy="2096262"/>
@@ -4138,8 +4242,266 @@
     <w:p/>
     <w:p/>
     <w:p/>
-    <w:p/>
-    <w:p/>
+    <w:p>
+      <w:r>
+        <w:rPr>
+          <w:noProof/>
+        </w:rPr>
+        <w:lastRenderedPageBreak/>
+        <mc:AlternateContent>
+          <mc:Choice Requires="wps">
+            <w:drawing>
+              <wp:anchor distT="0" distB="0" distL="114300" distR="114300" simplePos="0" relativeHeight="251707392" behindDoc="0" locked="0" layoutInCell="1" allowOverlap="1" wp14:anchorId="58A790EE" wp14:editId="0029B5D5">
+                <wp:simplePos x="0" y="0"/>
+                <wp:positionH relativeFrom="column">
+                  <wp:posOffset>2237105</wp:posOffset>
+                </wp:positionH>
+                <wp:positionV relativeFrom="paragraph">
+                  <wp:posOffset>43815</wp:posOffset>
+                </wp:positionV>
+                <wp:extent cx="1328468" cy="319177"/>
+                <wp:effectExtent l="0" t="0" r="0" b="5080"/>
+                <wp:wrapNone/>
+                <wp:docPr id="652769075" name="Text Box 34"/>
+                <wp:cNvGraphicFramePr/>
+                <a:graphic xmlns:a="http://schemas.openxmlformats.org/drawingml/2006/main">
+                  <a:graphicData uri="http://schemas.microsoft.com/office/word/2010/wordprocessingShape">
+                    <wps:wsp>
+                      <wps:cNvSpPr txBox="1"/>
+                      <wps:spPr>
+                        <a:xfrm>
+                          <a:off x="0" y="0"/>
+                          <a:ext cx="1328468" cy="319177"/>
+                        </a:xfrm>
+                        <a:prstGeom prst="rect">
+                          <a:avLst/>
+                        </a:prstGeom>
+                        <a:noFill/>
+                        <a:ln w="6350">
+                          <a:noFill/>
+                        </a:ln>
+                      </wps:spPr>
+                      <wps:txbx>
+                        <w:txbxContent>
+                          <w:p>
+                            <w:pPr>
+                              <w:jc w:val="center"/>
+                            </w:pPr>
+                            <w:r>
+                              <w:t>CPU</w:t>
+                            </w:r>
+                          </w:p>
+                        </w:txbxContent>
+                      </wps:txbx>
+                      <wps:bodyPr rot="0" spcFirstLastPara="0" vertOverflow="overflow" horzOverflow="overflow" vert="horz" wrap="square" lIns="91440" tIns="45720" rIns="91440" bIns="45720" numCol="1" spcCol="0" rtlCol="0" fromWordArt="0" anchor="t" anchorCtr="0" forceAA="0" compatLnSpc="1">
+                        <a:prstTxWarp prst="textNoShape">
+                          <a:avLst/>
+                        </a:prstTxWarp>
+                        <a:noAutofit/>
+                      </wps:bodyPr>
+                    </wps:wsp>
+                  </a:graphicData>
+                </a:graphic>
+              </wp:anchor>
+            </w:drawing>
+          </mc:Choice>
+          <mc:Fallback>
+            <w:pict>
+              <v:shape w14:anchorId="58A790EE" id="Text Box 34" o:spid="_x0000_s1052" type="#_x0000_t202" style="position:absolute;margin-left:176.15pt;margin-top:3.45pt;width:104.6pt;height:25.15pt;z-index:251707392;visibility:visible;mso-wrap-style:square;mso-wrap-distance-left:9pt;mso-wrap-distance-top:0;mso-wrap-distance-right:9pt;mso-wrap-distance-bottom:0;mso-position-horizontal:absolute;mso-position-horizontal-relative:text;mso-position-vertical:absolute;mso-position-vertical-relative:text;v-text-anchor:top" o:gfxdata="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" filled="f" stroked="f" strokeweight=".5pt">
+                <v:textbox>
+                  <w:txbxContent>
+                    <w:p>
+                      <w:pPr>
+                        <w:jc w:val="center"/>
+                      </w:pPr>
+                      <w:r>
+                        <w:t>CPU</w:t>
+                      </w:r>
+                    </w:p>
+                  </w:txbxContent>
+                </v:textbox>
+              </v:shape>
+            </w:pict>
+          </mc:Fallback>
+        </mc:AlternateContent>
+      </w:r>
+    </w:p>
+    <w:p>
+      <w:pPr>
+        <w:jc w:val="center"/>
+      </w:pPr>
+      <w:r>
+        <w:rPr>
+          <w:noProof/>
+        </w:rPr>
+        <w:drawing>
+          <wp:inline distT="0" distB="0" distL="0" distR="0" wp14:anchorId="618C1230" wp14:editId="7ABD2BE1">
+            <wp:extent cx="3821502" cy="2342608"/>
+            <wp:effectExtent l="0" t="0" r="7620" b="635"/>
+            <wp:docPr id="750979974" name="Picture 1"/>
+            <wp:cNvGraphicFramePr>
+              <a:graphicFrameLocks xmlns:a="http://schemas.openxmlformats.org/drawingml/2006/main" noChangeAspect="1"/>
+            </wp:cNvGraphicFramePr>
+            <a:graphic xmlns:a="http://schemas.openxmlformats.org/drawingml/2006/main">
+              <a:graphicData uri="http://schemas.openxmlformats.org/drawingml/2006/picture">
+                <pic:pic xmlns:pic="http://schemas.openxmlformats.org/drawingml/2006/picture">
+                  <pic:nvPicPr>
+                    <pic:cNvPr id="750979974" name=""/>
+                    <pic:cNvPicPr/>
+                  </pic:nvPicPr>
+                  <pic:blipFill>
+                    <a:blip r:embed="rId11"/>
+                    <a:stretch>
+                      <a:fillRect/>
+                    </a:stretch>
+                  </pic:blipFill>
+                  <pic:spPr>
+                    <a:xfrm>
+                      <a:off x="0" y="0"/>
+                      <a:ext cx="3848052" cy="2358883"/>
+                    </a:xfrm>
+                    <a:prstGeom prst="rect">
+                      <a:avLst/>
+                    </a:prstGeom>
+                  </pic:spPr>
+                </pic:pic>
+              </a:graphicData>
+            </a:graphic>
+          </wp:inline>
+        </w:drawing>
+      </w:r>
+    </w:p>
+    <w:p>
+      <w:pPr>
+        <w:jc w:val="center"/>
+      </w:pPr>
+      <w:r>
+        <w:rPr>
+          <w:noProof/>
+        </w:rPr>
+        <mc:AlternateContent>
+          <mc:Choice Requires="wps">
+            <w:drawing>
+              <wp:anchor distT="0" distB="0" distL="114300" distR="114300" simplePos="0" relativeHeight="251709440" behindDoc="0" locked="0" layoutInCell="1" allowOverlap="1" wp14:anchorId="4DFD5546" wp14:editId="07EF3DFD">
+                <wp:simplePos x="0" y="0"/>
+                <wp:positionH relativeFrom="column">
+                  <wp:posOffset>2235200</wp:posOffset>
+                </wp:positionH>
+                <wp:positionV relativeFrom="paragraph">
+                  <wp:posOffset>51435</wp:posOffset>
+                </wp:positionV>
+                <wp:extent cx="1328468" cy="319177"/>
+                <wp:effectExtent l="0" t="0" r="0" b="5080"/>
+                <wp:wrapNone/>
+                <wp:docPr id="1860346469" name="Text Box 34"/>
+                <wp:cNvGraphicFramePr/>
+                <a:graphic xmlns:a="http://schemas.openxmlformats.org/drawingml/2006/main">
+                  <a:graphicData uri="http://schemas.microsoft.com/office/word/2010/wordprocessingShape">
+                    <wps:wsp>
+                      <wps:cNvSpPr txBox="1"/>
+                      <wps:spPr>
+                        <a:xfrm>
+                          <a:off x="0" y="0"/>
+                          <a:ext cx="1328468" cy="319177"/>
+                        </a:xfrm>
+                        <a:prstGeom prst="rect">
+                          <a:avLst/>
+                        </a:prstGeom>
+                        <a:noFill/>
+                        <a:ln w="6350">
+                          <a:noFill/>
+                        </a:ln>
+                      </wps:spPr>
+                      <wps:txbx>
+                        <w:txbxContent>
+                          <w:p>
+                            <w:pPr>
+                              <w:jc w:val="center"/>
+                            </w:pPr>
+                            <w:r>
+                              <w:t>GPU</w:t>
+                            </w:r>
+                          </w:p>
+                        </w:txbxContent>
+                      </wps:txbx>
+                      <wps:bodyPr rot="0" spcFirstLastPara="0" vertOverflow="overflow" horzOverflow="overflow" vert="horz" wrap="square" lIns="91440" tIns="45720" rIns="91440" bIns="45720" numCol="1" spcCol="0" rtlCol="0" fromWordArt="0" anchor="t" anchorCtr="0" forceAA="0" compatLnSpc="1">
+                        <a:prstTxWarp prst="textNoShape">
+                          <a:avLst/>
+                        </a:prstTxWarp>
+                        <a:noAutofit/>
+                      </wps:bodyPr>
+                    </wps:wsp>
+                  </a:graphicData>
+                </a:graphic>
+              </wp:anchor>
+            </w:drawing>
+          </mc:Choice>
+          <mc:Fallback>
+            <w:pict>
+              <v:shape w14:anchorId="4DFD5546" id="_x0000_s1053" type="#_x0000_t202" style="position:absolute;left:0;text-align:left;margin-left:176pt;margin-top:4.05pt;width:104.6pt;height:25.15pt;z-index:251709440;visibility:visible;mso-wrap-style:square;mso-wrap-distance-left:9pt;mso-wrap-distance-top:0;mso-wrap-distance-right:9pt;mso-wrap-distance-bottom:0;mso-position-horizontal:absolute;mso-position-horizontal-relative:text;mso-position-vertical:absolute;mso-position-vertical-relative:text;v-text-anchor:top" o:gfxdata="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" filled="f" stroked="f" strokeweight=".5pt">
+                <v:textbox>
+                  <w:txbxContent>
+                    <w:p>
+                      <w:pPr>
+                        <w:jc w:val="center"/>
+                      </w:pPr>
+                      <w:r>
+                        <w:t>GPU</w:t>
+                      </w:r>
+                    </w:p>
+                  </w:txbxContent>
+                </v:textbox>
+              </v:shape>
+            </w:pict>
+          </mc:Fallback>
+        </mc:AlternateContent>
+      </w:r>
+    </w:p>
+    <w:p>
+      <w:pPr>
+        <w:jc w:val="center"/>
+      </w:pPr>
+      <w:r>
+        <w:rPr>
+          <w:noProof/>
+        </w:rPr>
+        <w:drawing>
+          <wp:inline distT="0" distB="0" distL="0" distR="0" wp14:anchorId="47029580" wp14:editId="27666F2E">
+            <wp:extent cx="3847381" cy="2348241"/>
+            <wp:effectExtent l="0" t="0" r="1270" b="0"/>
+            <wp:docPr id="662499591" name="Picture 1"/>
+            <wp:cNvGraphicFramePr>
+              <a:graphicFrameLocks xmlns:a="http://schemas.openxmlformats.org/drawingml/2006/main" noChangeAspect="1"/>
+            </wp:cNvGraphicFramePr>
+            <a:graphic xmlns:a="http://schemas.openxmlformats.org/drawingml/2006/main">
+              <a:graphicData uri="http://schemas.openxmlformats.org/drawingml/2006/picture">
+                <pic:pic xmlns:pic="http://schemas.openxmlformats.org/drawingml/2006/picture">
+                  <pic:nvPicPr>
+                    <pic:cNvPr id="662499591" name=""/>
+                    <pic:cNvPicPr/>
+                  </pic:nvPicPr>
+                  <pic:blipFill>
+                    <a:blip r:embed="rId12"/>
+                    <a:stretch>
+                      <a:fillRect/>
+                    </a:stretch>
+                  </pic:blipFill>
+                  <pic:spPr>
+                    <a:xfrm>
+                      <a:off x="0" y="0"/>
+                      <a:ext cx="3865994" cy="2359601"/>
+                    </a:xfrm>
+                    <a:prstGeom prst="rect">
+                      <a:avLst/>
+                    </a:prstGeom>
+                  </pic:spPr>
+                </pic:pic>
+              </a:graphicData>
+            </a:graphic>
+          </wp:inline>
+        </w:drawing>
+      </w:r>
+    </w:p>
     <w:p/>
     <w:p/>
     <w:p/>
@@ -4791,6 +5153,7 @@
   <w:style w:type="character" w:default="1" w:styleId="DefaultParagraphFont">
     <w:name w:val="Default Paragraph Font"/>
     <w:uiPriority w:val="1"/>
+    <w:semiHidden/>
     <w:unhideWhenUsed/>
   </w:style>
   <w:style w:type="table" w:default="1" w:styleId="TableNormal">

</xml_diff>